<commit_message>
Intégrer Lesson 1 (Introduction 3DEXPERIENCE) dans le programme V6
Ajout d'un Module 1 en introduction, basé sur Lesson 1 de la documentation
officielle DS (pages 14-45, 3h + 1 exercice) :
- Architecture plateforme 3DEXPERIENCE (apps, Web n-tiers, offres Cloud)
- Baseline Behavior vs Customer-Specific Environment (CSE)
- Organisation Modeling & Secure Data Accesses (P&O, rôles, security context)
- Capacités de personnalisation Baseline (paramétisation, EKL, VBA, CAA)

Module 2 conserve l'intégralité des 24 thèmes d'automatisation CATIA (Lesson 6).
Objectifs pédagogiques mis à jour pour couvrir les deux modules.

https://claude.ai/code/session_01BKFw1pPPfkx1xTaXjcdiw8
</commit_message>
<xml_diff>
--- a/src/programme_formation_CATIA_V6_3DEXP_Automation.docx
+++ b/src/programme_formation_CATIA_V6_3DEXP_Automation.docx
@@ -368,7 +368,7 @@
               <w:jc w:val="both"/>
             </w:pPr>
             <w:r>
-              <w:t>À l'issue de cette formation, les participants maîtriseront l'automatisation de la plateforme 3DEXPERIENCE (CATIA V6) à travers VBScript, CATScript et VBA. Ils seront capables de créer et déboguer des macros métier, de naviguer dans la structure produit PLM, de concevoir des interfaces utilisateur VBA et d'intégrer leurs scripts dans les processus 3DEXPERIENCE.</w:t>
+              <w:t>À l'issue de cette formation, les participants maîtriseront l'architecture et les fondamentaux de la plateforme 3DEXPERIENCE, ainsi que l'automatisation CATIA via VBScript, CATScript et VBA. Ils seront capables de naviguer dans l'écosystème 3DEXPERIENCE, de comprendre les mécanismes de sécurité PLM (P&amp;O, Baseline Behavior), de créer et déboguer des macros métier, de naviguer dans la structure produit PLM et d'intégrer leurs scripts dans les processus 3DEXPERIENCE.</w:t>
             </w:r>
           </w:p>
           <w:p>
@@ -897,6 +897,188 @@
               <w:rPr/>
             </w:pPr>
             <w:r>
+              <w:t>── MODULE 1 : Introduction à la plateforme 3DEXPERIENCE ──</w:t>
+            </w:r>
+          </w:p>
+          <w:p>
+            <w:pPr>
+              <w:pStyle w:val="ListParagraph"/>
+              <w:numPr>
+                <w:ilvl w:val="0"/>
+                <w:numId w:val="4"/>
+              </w:numPr>
+              <w:rPr/>
+            </w:pPr>
+            <w:r>
+              <w:t>Architecture de la plateforme 3DEXPERIENCE : applications et services (3DPassport, 3DSpace, 3DSearch, 3DCompass, 3DDashboard, 3DSwym, etc.)</w:t>
+            </w:r>
+          </w:p>
+          <w:p>
+            <w:pPr>
+              <w:pStyle w:val="ListParagraph"/>
+              <w:numPr>
+                <w:ilvl w:val="0"/>
+                <w:numId w:val="4"/>
+              </w:numPr>
+              <w:rPr/>
+            </w:pPr>
+            <w:r>
+              <w:t>Architecture Web n-tiers : couches Présentation, Logique et Données ; protocole HTTPS/WSS</w:t>
+            </w:r>
+          </w:p>
+          <w:p>
+            <w:pPr>
+              <w:pStyle w:val="ListParagraph"/>
+              <w:numPr>
+                <w:ilvl w:val="0"/>
+                <w:numId w:val="4"/>
+              </w:numPr>
+              <w:rPr/>
+            </w:pPr>
+            <w:r>
+              <w:t>Offres de déploiement Cloud : Public Cloud, Private Cloud, Dedicated Cloud (SaaS / IaaS / PaaS)</w:t>
+            </w:r>
+          </w:p>
+          <w:p>
+            <w:pPr>
+              <w:pStyle w:val="ListParagraph"/>
+              <w:numPr>
+                <w:ilvl w:val="0"/>
+                <w:numId w:val="4"/>
+              </w:numPr>
+              <w:rPr/>
+            </w:pPr>
+            <w:r>
+              <w:t>Baseline Behavior vs Customer-Specific Environment (CSE) : principes et choix d'architecture</w:t>
+            </w:r>
+          </w:p>
+          <w:p>
+            <w:pPr>
+              <w:pStyle w:val="ListParagraph"/>
+              <w:numPr>
+                <w:ilvl w:val="0"/>
+                <w:numId w:val="4"/>
+              </w:numPr>
+              <w:rPr/>
+            </w:pPr>
+            <w:r>
+              <w:t>Feuille de route de personnalisation Baseline et CSE (On Premises et Cloud)</w:t>
+            </w:r>
+          </w:p>
+          <w:p>
+            <w:pPr>
+              <w:pStyle w:val="ListParagraph"/>
+              <w:numPr>
+                <w:ilvl w:val="0"/>
+                <w:numId w:val="5"/>
+              </w:numPr>
+              <w:rPr/>
+            </w:pPr>
+            <w:r>
+              <w:t>Modélisation Organisationnelle et Accès Sécurisés aux Données (P&amp;O / Organization Modeling)</w:t>
+            </w:r>
+          </w:p>
+          <w:p>
+            <w:pPr>
+              <w:pStyle w:val="ListParagraph"/>
+              <w:numPr>
+                <w:ilvl w:val="0"/>
+                <w:numId w:val="6"/>
+              </w:numPr>
+              <w:rPr/>
+            </w:pPr>
+            <w:r>
+              <w:t>Concepts P&amp;O : Organisation, Collaborative Space, Rôle, Règle d'accès, Security Context, Ownership</w:t>
+            </w:r>
+          </w:p>
+          <w:p>
+            <w:pPr>
+              <w:pStyle w:val="ListParagraph"/>
+              <w:numPr>
+                <w:ilvl w:val="0"/>
+                <w:numId w:val="7"/>
+              </w:numPr>
+              <w:rPr/>
+            </w:pPr>
+            <w:r>
+              <w:t>Rôles Baseline : Reader, Contributor, Author, Leader, Owner, Administrator, Public Reader</w:t>
+            </w:r>
+          </w:p>
+          <w:p>
+            <w:pPr>
+              <w:pStyle w:val="ListParagraph"/>
+              <w:numPr>
+                <w:ilvl w:val="0"/>
+                <w:numId w:val="8"/>
+              </w:numPr>
+              <w:rPr/>
+            </w:pPr>
+            <w:r>
+              <w:t>Paramétisation Baseline via Collaborative Spaces Control Center (sans compétences IT avancées)</w:t>
+            </w:r>
+          </w:p>
+          <w:p>
+            <w:pPr>
+              <w:pStyle w:val="ListParagraph"/>
+              <w:numPr>
+                <w:ilvl w:val="0"/>
+                <w:numId w:val="8"/>
+              </w:numPr>
+              <w:rPr/>
+            </w:pPr>
+            <w:r>
+              <w:t>Capacités de personnalisation : Administration, Paramétisation, Adaptation, Développement (EKL, VBA, CAA, Widget)</w:t>
+            </w:r>
+          </w:p>
+          <w:p>
+            <w:pPr>
+              <w:pStyle w:val="ListParagraph"/>
+              <w:numPr>
+                <w:ilvl w:val="0"/>
+                <w:numId w:val="8"/>
+              </w:numPr>
+              <w:rPr/>
+            </w:pPr>
+            <w:r>
+              <w:t>Openness R2021x : langages supportés (EKL, VBA, JavaScript, HTML5, C++, JPO)</w:t>
+            </w:r>
+          </w:p>
+          <w:p>
+            <w:pPr>
+              <w:pStyle w:val="ListParagraph"/>
+              <w:numPr>
+                <w:ilvl w:val="0"/>
+                <w:numId w:val="8"/>
+              </w:numPr>
+              <w:rPr/>
+            </w:pPr>
+            <w:r>
+              <w:t>Exercice pratique : création d'un Collaborative Space, utilisateur et attributs sur type DS (VPMReference)</w:t>
+            </w:r>
+          </w:p>
+          <w:p>
+            <w:pPr>
+              <w:pStyle w:val="ListParagraph"/>
+              <w:numPr>
+                <w:ilvl w:val="0"/>
+                <w:numId w:val="8"/>
+              </w:numPr>
+              <w:rPr/>
+            </w:pPr>
+            <w:r>
+              <w:t>── MODULE 2 : Automatisation CATIA 3DEXPERIENCE (VBScript / VBA) ──</w:t>
+            </w:r>
+          </w:p>
+          <w:p>
+            <w:pPr>
+              <w:pStyle w:val="ListParagraph"/>
+              <w:numPr>
+                <w:ilvl w:val="0"/>
+                <w:numId w:val="8"/>
+              </w:numPr>
+              <w:rPr/>
+            </w:pPr>
+            <w:r>
               <w:t>Introduction à l'automatisation 3DEXPERIENCE (COM, Automation Objects)</w:t>
             </w:r>
           </w:p>
@@ -905,12 +1087,51 @@
               <w:pStyle w:val="ListParagraph"/>
               <w:numPr>
                 <w:ilvl w:val="0"/>
+                <w:numId w:val="9"/>
+              </w:numPr>
+              <w:rPr/>
+            </w:pPr>
+            <w:r>
+              <w:t>Langages de script : CATScript, MS VBScript, VBA, VSTA – usages et recommandations Dassault Systèmes</w:t>
+            </w:r>
+          </w:p>
+          <w:p>
+            <w:pPr>
+              <w:pStyle w:val="ListParagraph"/>
+              <w:numPr>
+                <w:ilvl w:val="0"/>
+                <w:numId w:val="9"/>
+              </w:numPr>
+              <w:rPr/>
+            </w:pPr>
+            <w:r>
+              <w:t>Gestion des Macro Libraries PLM (PLM Directories, PLM VBA Projects, PLM VSTA Projects)</w:t>
+            </w:r>
+          </w:p>
+          <w:p>
+            <w:pPr>
+              <w:pStyle w:val="ListParagraph"/>
+              <w:numPr>
+                <w:ilvl w:val="0"/>
+                <w:numId w:val="9"/>
+              </w:numPr>
+              <w:rPr/>
+            </w:pPr>
+            <w:r>
+              <w:t>Préférences d'automatisation et configuration de l'environnement de développement</w:t>
+            </w:r>
+          </w:p>
+          <w:p>
+            <w:pPr>
+              <w:pStyle w:val="ListParagraph"/>
+              <w:numPr>
+                <w:ilvl w:val="0"/>
                 <w:numId w:val="4"/>
               </w:numPr>
               <w:rPr/>
             </w:pPr>
             <w:r>
-              <w:t>Langages de script : CATScript, MS VBScript, VBA, VSTA – usages et recommandations Dassault Systèmes</w:t>
+              <w:t>Architecture Objet : Object, Collection, Property, Method – Héritage et Agrégation</w:t>
             </w:r>
           </w:p>
           <w:p>
@@ -923,7 +1144,7 @@
               <w:rPr/>
             </w:pPr>
             <w:r>
-              <w:t>Gestion des Macro Libraries PLM (PLM Directories, PLM VBA Projects, PLM VSTA Projects)</w:t>
+              <w:t>Objets fondamentaux de l'API : Application, Editor, Editors, Selection, Service</w:t>
             </w:r>
           </w:p>
           <w:p>
@@ -936,7 +1157,7 @@
               <w:rPr/>
             </w:pPr>
             <w:r>
-              <w:t>Préférences d'automatisation et configuration de l'environnement de développement</w:t>
+              <w:t>Services PLM : Session-level Service et Editor-level Service</w:t>
             </w:r>
           </w:p>
           <w:p>
@@ -949,7 +1170,7 @@
               <w:rPr/>
             </w:pPr>
             <w:r>
-              <w:t>Architecture Objet : Object, Collection, Property, Method – Héritage et Agrégation</w:t>
+              <w:t>Création et exécution de macros CATScript et MS VBScript</w:t>
             </w:r>
           </w:p>
           <w:p>
@@ -962,149 +1183,110 @@
               <w:rPr/>
             </w:pPr>
             <w:r>
-              <w:t>Objets fondamentaux de l'API : Application, Editor, Editors, Selection, Service</w:t>
-            </w:r>
-          </w:p>
-          <w:p>
-            <w:pPr>
-              <w:pStyle w:val="ListParagraph"/>
-              <w:numPr>
-                <w:ilvl w:val="0"/>
-                <w:numId w:val="5"/>
+              <w:t>Différences CATScript / MS VBScript – bonne pratique : préférer MS VBScript</w:t>
+            </w:r>
+          </w:p>
+          <w:p>
+            <w:pPr>
+              <w:pStyle w:val="ListParagraph"/>
+              <w:numPr>
+                <w:ilvl w:val="0"/>
+                <w:numId w:val="4"/>
               </w:numPr>
               <w:rPr/>
             </w:pPr>
             <w:r>
-              <w:t>Services PLM : Session-level Service et Editor-level Service</w:t>
-            </w:r>
-          </w:p>
-          <w:p>
-            <w:pPr>
-              <w:pStyle w:val="ListParagraph"/>
-              <w:numPr>
-                <w:ilvl w:val="0"/>
-                <w:numId w:val="6"/>
+              <w:t>Enregistrement automatique de macros (Macro Recorder)</w:t>
+            </w:r>
+          </w:p>
+          <w:p>
+            <w:pPr>
+              <w:pStyle w:val="ListParagraph"/>
+              <w:numPr>
+                <w:ilvl w:val="0"/>
+                <w:numId w:val="4"/>
               </w:numPr>
               <w:rPr/>
             </w:pPr>
             <w:r>
-              <w:t>Création et exécution de macros CATScript et MS VBScript</w:t>
-            </w:r>
-          </w:p>
-          <w:p>
-            <w:pPr>
-              <w:pStyle w:val="ListParagraph"/>
-              <w:numPr>
-                <w:ilvl w:val="0"/>
-                <w:numId w:val="7"/>
+              <w:t>Outils de l'éditeur de macros : Object Browser, Help Automation, Code Snippets</w:t>
+            </w:r>
+          </w:p>
+          <w:p>
+            <w:pPr>
+              <w:pStyle w:val="ListParagraph"/>
+              <w:numPr>
+                <w:ilvl w:val="0"/>
+                <w:numId w:val="4"/>
               </w:numPr>
               <w:rPr/>
             </w:pPr>
             <w:r>
-              <w:t>Différences CATScript / MS VBScript – bonne pratique : préférer MS VBScript</w:t>
-            </w:r>
-          </w:p>
-          <w:p>
-            <w:pPr>
-              <w:pStyle w:val="ListParagraph"/>
-              <w:numPr>
-                <w:ilvl w:val="0"/>
-                <w:numId w:val="8"/>
+              <w:t>Création de macros VBA dans l'IDE Microsoft Visual Basic (IntelliSense, Debugger)</w:t>
+            </w:r>
+          </w:p>
+          <w:p>
+            <w:pPr>
+              <w:pStyle w:val="ListParagraph"/>
+              <w:numPr>
+                <w:ilvl w:val="0"/>
+                <w:numId w:val="4"/>
               </w:numPr>
               <w:rPr/>
             </w:pPr>
             <w:r>
-              <w:t>Enregistrement automatique de macros (Macro Recorder)</w:t>
-            </w:r>
-          </w:p>
-          <w:p>
-            <w:pPr>
-              <w:pStyle w:val="ListParagraph"/>
-              <w:numPr>
-                <w:ilvl w:val="0"/>
-                <w:numId w:val="8"/>
+              <w:t>Modes d'exécution VBA : normal (F5), pas à pas (F8)</w:t>
+            </w:r>
+          </w:p>
+          <w:p>
+            <w:pPr>
+              <w:pStyle w:val="ListParagraph"/>
+              <w:numPr>
+                <w:ilvl w:val="0"/>
+                <w:numId w:val="4"/>
               </w:numPr>
               <w:rPr/>
             </w:pPr>
             <w:r>
-              <w:t>Outils de l'éditeur de macros : Object Browser, Help Automation, Code Snippets</w:t>
-            </w:r>
-          </w:p>
-          <w:p>
-            <w:pPr>
-              <w:pStyle w:val="ListParagraph"/>
-              <w:numPr>
-                <w:ilvl w:val="0"/>
-                <w:numId w:val="8"/>
+              <w:t>Navigation dans la structure produit PLM : Occurrence, VPMReference, VPMInstance</w:t>
+            </w:r>
+          </w:p>
+          <w:p>
+            <w:pPr>
+              <w:pStyle w:val="ListParagraph"/>
+              <w:numPr>
+                <w:ilvl w:val="0"/>
+                <w:numId w:val="4"/>
               </w:numPr>
               <w:rPr/>
             </w:pPr>
             <w:r>
-              <w:t>Création de macros VBA dans l'IDE Microsoft Visual Basic (IntelliSense, Debugger)</w:t>
-            </w:r>
-          </w:p>
-          <w:p>
-            <w:pPr>
-              <w:pStyle w:val="ListParagraph"/>
-              <w:numPr>
-                <w:ilvl w:val="0"/>
-                <w:numId w:val="8"/>
+              <w:t>Récupération d'objets PLM depuis l'éditeur actif (ActiveEditor, ActiveObject)</w:t>
+            </w:r>
+          </w:p>
+          <w:p>
+            <w:pPr>
+              <w:pStyle w:val="ListParagraph"/>
+              <w:numPr>
+                <w:ilvl w:val="0"/>
+                <w:numId w:val="4"/>
               </w:numPr>
               <w:rPr/>
             </w:pPr>
             <w:r>
-              <w:t>Modes d'exécution VBA : normal (F5), pas à pas (F8)</w:t>
-            </w:r>
-          </w:p>
-          <w:p>
-            <w:pPr>
-              <w:pStyle w:val="ListParagraph"/>
-              <w:numPr>
-                <w:ilvl w:val="0"/>
-                <w:numId w:val="8"/>
+              <w:t>Sélection graphique d'objets depuis un script</w:t>
+            </w:r>
+          </w:p>
+          <w:p>
+            <w:pPr>
+              <w:pStyle w:val="ListParagraph"/>
+              <w:numPr>
+                <w:ilvl w:val="0"/>
+                <w:numId w:val="4"/>
               </w:numPr>
               <w:rPr/>
             </w:pPr>
             <w:r>
-              <w:t>Navigation dans la structure produit PLM : Occurrence, VPMReference, VPMInstance</w:t>
-            </w:r>
-          </w:p>
-          <w:p>
-            <w:pPr>
-              <w:pStyle w:val="ListParagraph"/>
-              <w:numPr>
-                <w:ilvl w:val="0"/>
-                <w:numId w:val="8"/>
-              </w:numPr>
-              <w:rPr/>
-            </w:pPr>
-            <w:r>
-              <w:t>Récupération d'objets PLM depuis l'éditeur actif (ActiveEditor, ActiveObject)</w:t>
-            </w:r>
-          </w:p>
-          <w:p>
-            <w:pPr>
-              <w:pStyle w:val="ListParagraph"/>
-              <w:numPr>
-                <w:ilvl w:val="0"/>
-                <w:numId w:val="9"/>
-              </w:numPr>
-              <w:rPr/>
-            </w:pPr>
-            <w:r>
-              <w:t>Sélection graphique d'objets depuis un script</w:t>
-            </w:r>
-          </w:p>
-          <w:p>
-            <w:pPr>
-              <w:pStyle w:val="ListParagraph"/>
-              <w:numPr>
-                <w:ilvl w:val="0"/>
-                <w:numId w:val="9"/>
-              </w:numPr>
-              <w:rPr/>
-            </w:pPr>
-            <w:r>
               <w:t>Création d'interfaces utilisateur avancées (UserForms VBA)</w:t>
             </w:r>
           </w:p>
@@ -1113,7 +1295,7 @@
               <w:pStyle w:val="ListParagraph"/>
               <w:numPr>
                 <w:ilvl w:val="0"/>
-                <w:numId w:val="9"/>
+                <w:numId w:val="4"/>
               </w:numPr>
               <w:rPr/>
             </w:pPr>

</xml_diff>

<commit_message>
Alléger Module 1 : garder uniquement l'essentiel pour l'automatisation
Module 1 réduit à 3 points ciblés (au lieu de 13) :
- Vue d'ensemble écosystème 3DEXPERIENCE (contexte automation)
- Niveaux de personnalisation DS (situer VBA dans la hiérarchie)
- Macro Libraries PLM (lien direct avec Module 2)

Module 2 inchangé (24 thèmes VBScript/VBA).

https://claude.ai/code/session_01BKFw1pPPfkx1xTaXjcdiw8
</commit_message>
<xml_diff>
--- a/src/programme_formation_CATIA_V6_3DEXP_Automation.docx
+++ b/src/programme_formation_CATIA_V6_3DEXP_Automation.docx
@@ -897,7 +897,7 @@
               <w:rPr/>
             </w:pPr>
             <w:r>
-              <w:t>── MODULE 1 : Introduction à la plateforme 3DEXPERIENCE ──</w:t>
+              <w:t>── MODULE 1 : Présentation de la plateforme 3DEXPERIENCE ──</w:t>
             </w:r>
           </w:p>
           <w:p>
@@ -910,7 +910,7 @@
               <w:rPr/>
             </w:pPr>
             <w:r>
-              <w:t>Architecture de la plateforme 3DEXPERIENCE : applications et services (3DPassport, 3DSpace, 3DSearch, 3DCompass, 3DDashboard, 3DSwym, etc.)</w:t>
+              <w:t>Vue d'ensemble de l'écosystème 3DEXPERIENCE : applications clés (3DSpace, 3DCompass, 3DDashboard, 3DPassport) et positionnement de l'automatisation</w:t>
             </w:r>
           </w:p>
           <w:p>
@@ -923,7 +923,7 @@
               <w:rPr/>
             </w:pPr>
             <w:r>
-              <w:t>Architecture Web n-tiers : couches Présentation, Logique et Données ; protocole HTTPS/WSS</w:t>
+              <w:t>Niveaux de personnalisation : Administration, Paramétisation, Adaptation, Développement (EKL, VBA, CAA, Widget)</w:t>
             </w:r>
           </w:p>
           <w:p>
@@ -936,7 +936,7 @@
               <w:rPr/>
             </w:pPr>
             <w:r>
-              <w:t>Offres de déploiement Cloud : Public Cloud, Private Cloud, Dedicated Cloud (SaaS / IaaS / PaaS)</w:t>
+              <w:t>Macro Libraries PLM : PLM Directories, PLM VBA Projects, PLM VSTA Projects — organisation et déploiement</w:t>
             </w:r>
           </w:p>
           <w:p>
@@ -949,7 +949,7 @@
               <w:rPr/>
             </w:pPr>
             <w:r>
-              <w:t>Baseline Behavior vs Customer-Specific Environment (CSE) : principes et choix d'architecture</w:t>
+              <w:t>── MODULE 2 : Automatisation CATIA 3DEXPERIENCE (VBScript / VBA) ──</w:t>
             </w:r>
           </w:p>
           <w:p>
@@ -962,7 +962,7 @@
               <w:rPr/>
             </w:pPr>
             <w:r>
-              <w:t>Feuille de route de personnalisation Baseline et CSE (On Premises et Cloud)</w:t>
+              <w:t>Introduction à l'automatisation 3DEXPERIENCE (COM, Automation Objects)</w:t>
             </w:r>
           </w:p>
           <w:p>
@@ -975,7 +975,7 @@
               <w:rPr/>
             </w:pPr>
             <w:r>
-              <w:t>Modélisation Organisationnelle et Accès Sécurisés aux Données (P&amp;O / Organization Modeling)</w:t>
+              <w:t>Langages de script : CATScript, MS VBScript, VBA, VSTA – usages et recommandations Dassault Systèmes</w:t>
             </w:r>
           </w:p>
           <w:p>
@@ -988,7 +988,7 @@
               <w:rPr/>
             </w:pPr>
             <w:r>
-              <w:t>Concepts P&amp;O : Organisation, Collaborative Space, Rôle, Règle d'accès, Security Context, Ownership</w:t>
+              <w:t>Gestion des Macro Libraries PLM (PLM Directories, PLM VBA Projects, PLM VSTA Projects)</w:t>
             </w:r>
           </w:p>
           <w:p>
@@ -1001,7 +1001,7 @@
               <w:rPr/>
             </w:pPr>
             <w:r>
-              <w:t>Rôles Baseline : Reader, Contributor, Author, Leader, Owner, Administrator, Public Reader</w:t>
+              <w:t>Préférences d'automatisation et configuration de l'environnement de développement</w:t>
             </w:r>
           </w:p>
           <w:p>
@@ -1014,7 +1014,7 @@
               <w:rPr/>
             </w:pPr>
             <w:r>
-              <w:t>Paramétisation Baseline via Collaborative Spaces Control Center (sans compétences IT avancées)</w:t>
+              <w:t>Architecture Objet : Object, Collection, Property, Method – Héritage et Agrégation</w:t>
             </w:r>
           </w:p>
           <w:p>
@@ -1027,7 +1027,7 @@
               <w:rPr/>
             </w:pPr>
             <w:r>
-              <w:t>Capacités de personnalisation : Administration, Paramétisation, Adaptation, Développement (EKL, VBA, CAA, Widget)</w:t>
+              <w:t>Objets fondamentaux de l'API : Application, Editor, Editors, Selection, Service</w:t>
             </w:r>
           </w:p>
           <w:p>
@@ -1040,7 +1040,7 @@
               <w:rPr/>
             </w:pPr>
             <w:r>
-              <w:t>Openness R2021x : langages supportés (EKL, VBA, JavaScript, HTML5, C++, JPO)</w:t>
+              <w:t>Services PLM : Session-level Service et Editor-level Service</w:t>
             </w:r>
           </w:p>
           <w:p>
@@ -1053,7 +1053,7 @@
               <w:rPr/>
             </w:pPr>
             <w:r>
-              <w:t>Exercice pratique : création d'un Collaborative Space, utilisateur et attributs sur type DS (VPMReference)</w:t>
+              <w:t>Création et exécution de macros CATScript et MS VBScript</w:t>
             </w:r>
           </w:p>
           <w:p>
@@ -1066,7 +1066,7 @@
               <w:rPr/>
             </w:pPr>
             <w:r>
-              <w:t>── MODULE 2 : Automatisation CATIA 3DEXPERIENCE (VBScript / VBA) ──</w:t>
+              <w:t>Différences CATScript / MS VBScript – bonne pratique : préférer MS VBScript</w:t>
             </w:r>
           </w:p>
           <w:p>
@@ -1079,7 +1079,7 @@
               <w:rPr/>
             </w:pPr>
             <w:r>
-              <w:t>Introduction à l'automatisation 3DEXPERIENCE (COM, Automation Objects)</w:t>
+              <w:t>Enregistrement automatique de macros (Macro Recorder)</w:t>
             </w:r>
           </w:p>
           <w:p>
@@ -1092,7 +1092,7 @@
               <w:rPr/>
             </w:pPr>
             <w:r>
-              <w:t>Langages de script : CATScript, MS VBScript, VBA, VSTA – usages et recommandations Dassault Systèmes</w:t>
+              <w:t>Outils de l'éditeur de macros : Object Browser, Help Automation, Code Snippets</w:t>
             </w:r>
           </w:p>
           <w:p>
@@ -1105,7 +1105,7 @@
               <w:rPr/>
             </w:pPr>
             <w:r>
-              <w:t>Gestion des Macro Libraries PLM (PLM Directories, PLM VBA Projects, PLM VSTA Projects)</w:t>
+              <w:t>Création de macros VBA dans l'IDE Microsoft Visual Basic (IntelliSense, Debugger)</w:t>
             </w:r>
           </w:p>
           <w:p>
@@ -1118,7 +1118,7 @@
               <w:rPr/>
             </w:pPr>
             <w:r>
-              <w:t>Préférences d'automatisation et configuration de l'environnement de développement</w:t>
+              <w:t>Modes d'exécution VBA : normal (F5), pas à pas (F8)</w:t>
             </w:r>
           </w:p>
           <w:p>
@@ -1131,7 +1131,7 @@
               <w:rPr/>
             </w:pPr>
             <w:r>
-              <w:t>Architecture Objet : Object, Collection, Property, Method – Héritage et Agrégation</w:t>
+              <w:t>Navigation dans la structure produit PLM : Occurrence, VPMReference, VPMInstance</w:t>
             </w:r>
           </w:p>
           <w:p>
@@ -1144,7 +1144,7 @@
               <w:rPr/>
             </w:pPr>
             <w:r>
-              <w:t>Objets fondamentaux de l'API : Application, Editor, Editors, Selection, Service</w:t>
+              <w:t>Récupération d'objets PLM depuis l'éditeur actif (ActiveEditor, ActiveObject)</w:t>
             </w:r>
           </w:p>
           <w:p>
@@ -1157,7 +1157,7 @@
               <w:rPr/>
             </w:pPr>
             <w:r>
-              <w:t>Services PLM : Session-level Service et Editor-level Service</w:t>
+              <w:t>Sélection graphique d'objets depuis un script</w:t>
             </w:r>
           </w:p>
           <w:p>
@@ -1170,7 +1170,7 @@
               <w:rPr/>
             </w:pPr>
             <w:r>
-              <w:t>Création et exécution de macros CATScript et MS VBScript</w:t>
+              <w:t>Création d'interfaces utilisateur avancées (UserForms VBA)</w:t>
             </w:r>
           </w:p>
           <w:p>
@@ -1183,7 +1183,7 @@
               <w:rPr/>
             </w:pPr>
             <w:r>
-              <w:t>Différences CATScript / MS VBScript – bonne pratique : préférer MS VBScript</w:t>
+              <w:t>Intégration EKL : appel de VBScript depuis une Action EKL (actionVB → Run())</w:t>
             </w:r>
           </w:p>
           <w:p>
@@ -1196,7 +1196,7 @@
               <w:rPr/>
             </w:pPr>
             <w:r>
-              <w:t>Enregistrement automatique de macros (Macro Recorder)</w:t>
+              <w:t>Export de la structure produit en XML et génération de BOM CAD</w:t>
             </w:r>
           </w:p>
           <w:p>
@@ -1209,7 +1209,7 @@
               <w:rPr/>
             </w:pPr>
             <w:r>
-              <w:t>Outils de l'éditeur de macros : Object Browser, Help Automation, Code Snippets</w:t>
+              <w:t>Automatisation de la création de géométrie (Part Design – cylindre, pad, poche)</w:t>
             </w:r>
           </w:p>
           <w:p>
@@ -1222,7 +1222,7 @@
               <w:rPr/>
             </w:pPr>
             <w:r>
-              <w:t>Création de macros VBA dans l'IDE Microsoft Visual Basic (IntelliSense, Debugger)</w:t>
+              <w:t>Personnalisation de l'Action Bar : Section personnalisée, Icône, Commande liée à une macro</w:t>
             </w:r>
           </w:p>
           <w:p>
@@ -1235,7 +1235,7 @@
               <w:rPr/>
             </w:pPr>
             <w:r>
-              <w:t>Modes d'exécution VBA : normal (F5), pas à pas (F8)</w:t>
+              <w:t>Contrôle des droits d'édition des macros (Control Content Privileges)</w:t>
             </w:r>
           </w:p>
           <w:p>
@@ -1248,7 +1248,7 @@
               <w:rPr/>
             </w:pPr>
             <w:r>
-              <w:t>Navigation dans la structure produit PLM : Occurrence, VPMReference, VPMInstance</w:t>
+              <w:t>Export et partage de Macro Libraries (format 3DXML)</w:t>
             </w:r>
           </w:p>
           <w:p>
@@ -1261,7 +1261,7 @@
               <w:rPr/>
             </w:pPr>
             <w:r>
-              <w:t>Récupération d'objets PLM depuis l'éditeur actif (ActiveEditor, ActiveObject)</w:t>
+              <w:t>Extension optionnelle : Introduction à Python pour l'automatisation 3DEXPERIENCE (R2017x+)</w:t>
             </w:r>
           </w:p>
           <w:p>
@@ -1273,9 +1273,6 @@
               </w:numPr>
               <w:rPr/>
             </w:pPr>
-            <w:r>
-              <w:t>Sélection graphique d'objets depuis un script</w:t>
-            </w:r>
           </w:p>
           <w:p>
             <w:pPr>
@@ -1286,9 +1283,6 @@
               </w:numPr>
               <w:rPr/>
             </w:pPr>
-            <w:r>
-              <w:t>Création d'interfaces utilisateur avancées (UserForms VBA)</w:t>
-            </w:r>
           </w:p>
           <w:p>
             <w:pPr>
@@ -1299,9 +1293,6 @@
               </w:numPr>
               <w:rPr/>
             </w:pPr>
-            <w:r>
-              <w:t>Intégration EKL : appel de VBScript depuis une Action EKL (actionVB → Run())</w:t>
-            </w:r>
           </w:p>
           <w:p>
             <w:pPr>
@@ -1312,9 +1303,6 @@
               </w:numPr>
               <w:rPr/>
             </w:pPr>
-            <w:r>
-              <w:t>Export de la structure produit en XML et génération de BOM CAD</w:t>
-            </w:r>
           </w:p>
           <w:p>
             <w:pPr>
@@ -1325,9 +1313,6 @@
               </w:numPr>
               <w:rPr/>
             </w:pPr>
-            <w:r>
-              <w:t>Automatisation de la création de géométrie (Part Design – cylindre, pad, poche)</w:t>
-            </w:r>
           </w:p>
           <w:p>
             <w:pPr>
@@ -1338,9 +1323,6 @@
               </w:numPr>
               <w:rPr/>
             </w:pPr>
-            <w:r>
-              <w:t>Personnalisation de l'Action Bar : Section personnalisée, Icône, Commande liée à une macro</w:t>
-            </w:r>
           </w:p>
           <w:p>
             <w:pPr>
@@ -1351,9 +1333,6 @@
               </w:numPr>
               <w:rPr/>
             </w:pPr>
-            <w:r>
-              <w:t>Contrôle des droits d'édition des macros (Control Content Privileges)</w:t>
-            </w:r>
           </w:p>
           <w:p>
             <w:pPr>
@@ -1364,9 +1343,6 @@
               </w:numPr>
               <w:rPr/>
             </w:pPr>
-            <w:r>
-              <w:t>Export et partage de Macro Libraries (format 3DXML)</w:t>
-            </w:r>
           </w:p>
           <w:p>
             <w:pPr>
@@ -1377,9 +1353,6 @@
               </w:numPr>
               <w:rPr/>
             </w:pPr>
-            <w:r>
-              <w:t>Extension optionnelle : Introduction à Python pour l'automatisation 3DEXPERIENCE (R2017x+)</w:t>
-            </w:r>
           </w:p>
           <w:p>
             <w:pPr>

</xml_diff>

<commit_message>
Restaurer Module 1 complet (Lesson 1 intégrale de DS)
Retour à la version complète avec les 4 topics officiels DS :
1. Architecture 3DEXPERIENCE (apps, Web n-tiers, Cloud)
2. Baseline Behavior vs CSE
3. Organization Modeling & Secure Data Accesses (P&O)
4. Baseline Customization Capabilities Overview

13 points de contenu + exercice VPMReference, conformes à la
structure pédagogique officielle Dassault Systèmes.

https://claude.ai/code/session_01BKFw1pPPfkx1xTaXjcdiw8
</commit_message>
<xml_diff>
--- a/src/programme_formation_CATIA_V6_3DEXP_Automation.docx
+++ b/src/programme_formation_CATIA_V6_3DEXP_Automation.docx
@@ -897,7 +897,7 @@
               <w:rPr/>
             </w:pPr>
             <w:r>
-              <w:t>── MODULE 1 : Présentation de la plateforme 3DEXPERIENCE ──</w:t>
+              <w:t>── MODULE 1 : Introduction à la plateforme 3DEXPERIENCE ──</w:t>
             </w:r>
           </w:p>
           <w:p>
@@ -910,7 +910,7 @@
               <w:rPr/>
             </w:pPr>
             <w:r>
-              <w:t>Vue d'ensemble de l'écosystème 3DEXPERIENCE : applications clés (3DSpace, 3DCompass, 3DDashboard, 3DPassport) et positionnement de l'automatisation</w:t>
+              <w:t>Architecture de la plateforme 3DEXPERIENCE : applications et services (3DPassport, 3DSpace, 3DSearch, 3DCompass, 3DDashboard, 3DSwym, etc.)</w:t>
             </w:r>
           </w:p>
           <w:p>
@@ -923,7 +923,7 @@
               <w:rPr/>
             </w:pPr>
             <w:r>
-              <w:t>Niveaux de personnalisation : Administration, Paramétisation, Adaptation, Développement (EKL, VBA, CAA, Widget)</w:t>
+              <w:t>Architecture Web n-tiers : couches Présentation, Logique et Données ; protocole HTTPS/WSS</w:t>
             </w:r>
           </w:p>
           <w:p>
@@ -936,7 +936,7 @@
               <w:rPr/>
             </w:pPr>
             <w:r>
-              <w:t>Macro Libraries PLM : PLM Directories, PLM VBA Projects, PLM VSTA Projects — organisation et déploiement</w:t>
+              <w:t>Offres de déploiement Cloud : Public Cloud, Private Cloud, Dedicated Cloud (SaaS / IaaS / PaaS)</w:t>
             </w:r>
           </w:p>
           <w:p>
@@ -949,6 +949,123 @@
               <w:rPr/>
             </w:pPr>
             <w:r>
+              <w:t>Baseline Behavior vs Customer-Specific Environment (CSE) : principes et choix d'architecture</w:t>
+            </w:r>
+          </w:p>
+          <w:p>
+            <w:pPr>
+              <w:pStyle w:val="ListParagraph"/>
+              <w:numPr>
+                <w:ilvl w:val="0"/>
+                <w:numId w:val="4"/>
+              </w:numPr>
+              <w:rPr/>
+            </w:pPr>
+            <w:r>
+              <w:t>Feuille de route de personnalisation Baseline et CSE (On Premises et Cloud)</w:t>
+            </w:r>
+          </w:p>
+          <w:p>
+            <w:pPr>
+              <w:pStyle w:val="ListParagraph"/>
+              <w:numPr>
+                <w:ilvl w:val="0"/>
+                <w:numId w:val="5"/>
+              </w:numPr>
+              <w:rPr/>
+            </w:pPr>
+            <w:r>
+              <w:t>Modélisation Organisationnelle et Accès Sécurisés aux Données (P&amp;O / Organization Modeling)</w:t>
+            </w:r>
+          </w:p>
+          <w:p>
+            <w:pPr>
+              <w:pStyle w:val="ListParagraph"/>
+              <w:numPr>
+                <w:ilvl w:val="0"/>
+                <w:numId w:val="6"/>
+              </w:numPr>
+              <w:rPr/>
+            </w:pPr>
+            <w:r>
+              <w:t>Concepts P&amp;O : Organisation, Collaborative Space, Rôle, Règle d'accès, Security Context, Ownership</w:t>
+            </w:r>
+          </w:p>
+          <w:p>
+            <w:pPr>
+              <w:pStyle w:val="ListParagraph"/>
+              <w:numPr>
+                <w:ilvl w:val="0"/>
+                <w:numId w:val="7"/>
+              </w:numPr>
+              <w:rPr/>
+            </w:pPr>
+            <w:r>
+              <w:t>Rôles Baseline : Reader, Contributor, Author, Leader, Owner, Administrator, Public Reader</w:t>
+            </w:r>
+          </w:p>
+          <w:p>
+            <w:pPr>
+              <w:pStyle w:val="ListParagraph"/>
+              <w:numPr>
+                <w:ilvl w:val="0"/>
+                <w:numId w:val="8"/>
+              </w:numPr>
+              <w:rPr/>
+            </w:pPr>
+            <w:r>
+              <w:t>Paramétisation Baseline via Collaborative Spaces Control Center (sans compétences IT avancées)</w:t>
+            </w:r>
+          </w:p>
+          <w:p>
+            <w:pPr>
+              <w:pStyle w:val="ListParagraph"/>
+              <w:numPr>
+                <w:ilvl w:val="0"/>
+                <w:numId w:val="8"/>
+              </w:numPr>
+              <w:rPr/>
+            </w:pPr>
+            <w:r>
+              <w:t>Capacités de personnalisation : Administration, Paramétisation, Adaptation, Développement (EKL, VBA, CAA, Widget)</w:t>
+            </w:r>
+          </w:p>
+          <w:p>
+            <w:pPr>
+              <w:pStyle w:val="ListParagraph"/>
+              <w:numPr>
+                <w:ilvl w:val="0"/>
+                <w:numId w:val="8"/>
+              </w:numPr>
+              <w:rPr/>
+            </w:pPr>
+            <w:r>
+              <w:t>Openness R2021x : langages supportés (EKL, VBA, JavaScript, HTML5, C++, JPO)</w:t>
+            </w:r>
+          </w:p>
+          <w:p>
+            <w:pPr>
+              <w:pStyle w:val="ListParagraph"/>
+              <w:numPr>
+                <w:ilvl w:val="0"/>
+                <w:numId w:val="8"/>
+              </w:numPr>
+              <w:rPr/>
+            </w:pPr>
+            <w:r>
+              <w:t>Exercice pratique : création d'un Collaborative Space, utilisateur et attributs sur type DS (VPMReference)</w:t>
+            </w:r>
+          </w:p>
+          <w:p>
+            <w:pPr>
+              <w:pStyle w:val="ListParagraph"/>
+              <w:numPr>
+                <w:ilvl w:val="0"/>
+                <w:numId w:val="8"/>
+              </w:numPr>
+              <w:rPr/>
+            </w:pPr>
+            <w:r>
               <w:t>── MODULE 2 : Automatisation CATIA 3DEXPERIENCE (VBScript / VBA) ──</w:t>
             </w:r>
           </w:p>
@@ -957,63 +1074,63 @@
               <w:pStyle w:val="ListParagraph"/>
               <w:numPr>
                 <w:ilvl w:val="0"/>
+                <w:numId w:val="8"/>
+              </w:numPr>
+              <w:rPr/>
+            </w:pPr>
+            <w:r>
+              <w:t>Introduction à l'automatisation 3DEXPERIENCE (COM, Automation Objects)</w:t>
+            </w:r>
+          </w:p>
+          <w:p>
+            <w:pPr>
+              <w:pStyle w:val="ListParagraph"/>
+              <w:numPr>
+                <w:ilvl w:val="0"/>
+                <w:numId w:val="9"/>
+              </w:numPr>
+              <w:rPr/>
+            </w:pPr>
+            <w:r>
+              <w:t>Langages de script : CATScript, MS VBScript, VBA, VSTA – usages et recommandations Dassault Systèmes</w:t>
+            </w:r>
+          </w:p>
+          <w:p>
+            <w:pPr>
+              <w:pStyle w:val="ListParagraph"/>
+              <w:numPr>
+                <w:ilvl w:val="0"/>
+                <w:numId w:val="9"/>
+              </w:numPr>
+              <w:rPr/>
+            </w:pPr>
+            <w:r>
+              <w:t>Gestion des Macro Libraries PLM (PLM Directories, PLM VBA Projects, PLM VSTA Projects)</w:t>
+            </w:r>
+          </w:p>
+          <w:p>
+            <w:pPr>
+              <w:pStyle w:val="ListParagraph"/>
+              <w:numPr>
+                <w:ilvl w:val="0"/>
+                <w:numId w:val="9"/>
+              </w:numPr>
+              <w:rPr/>
+            </w:pPr>
+            <w:r>
+              <w:t>Préférences d'automatisation et configuration de l'environnement de développement</w:t>
+            </w:r>
+          </w:p>
+          <w:p>
+            <w:pPr>
+              <w:pStyle w:val="ListParagraph"/>
+              <w:numPr>
+                <w:ilvl w:val="0"/>
                 <w:numId w:val="4"/>
               </w:numPr>
               <w:rPr/>
             </w:pPr>
             <w:r>
-              <w:t>Introduction à l'automatisation 3DEXPERIENCE (COM, Automation Objects)</w:t>
-            </w:r>
-          </w:p>
-          <w:p>
-            <w:pPr>
-              <w:pStyle w:val="ListParagraph"/>
-              <w:numPr>
-                <w:ilvl w:val="0"/>
-                <w:numId w:val="5"/>
-              </w:numPr>
-              <w:rPr/>
-            </w:pPr>
-            <w:r>
-              <w:t>Langages de script : CATScript, MS VBScript, VBA, VSTA – usages et recommandations Dassault Systèmes</w:t>
-            </w:r>
-          </w:p>
-          <w:p>
-            <w:pPr>
-              <w:pStyle w:val="ListParagraph"/>
-              <w:numPr>
-                <w:ilvl w:val="0"/>
-                <w:numId w:val="6"/>
-              </w:numPr>
-              <w:rPr/>
-            </w:pPr>
-            <w:r>
-              <w:t>Gestion des Macro Libraries PLM (PLM Directories, PLM VBA Projects, PLM VSTA Projects)</w:t>
-            </w:r>
-          </w:p>
-          <w:p>
-            <w:pPr>
-              <w:pStyle w:val="ListParagraph"/>
-              <w:numPr>
-                <w:ilvl w:val="0"/>
-                <w:numId w:val="7"/>
-              </w:numPr>
-              <w:rPr/>
-            </w:pPr>
-            <w:r>
-              <w:t>Préférences d'automatisation et configuration de l'environnement de développement</w:t>
-            </w:r>
-          </w:p>
-          <w:p>
-            <w:pPr>
-              <w:pStyle w:val="ListParagraph"/>
-              <w:numPr>
-                <w:ilvl w:val="0"/>
-                <w:numId w:val="8"/>
-              </w:numPr>
-              <w:rPr/>
-            </w:pPr>
-            <w:r>
               <w:t>Architecture Objet : Object, Collection, Property, Method – Héritage et Agrégation</w:t>
             </w:r>
           </w:p>
@@ -1022,7 +1139,7 @@
               <w:pStyle w:val="ListParagraph"/>
               <w:numPr>
                 <w:ilvl w:val="0"/>
-                <w:numId w:val="8"/>
+                <w:numId w:val="4"/>
               </w:numPr>
               <w:rPr/>
             </w:pPr>
@@ -1035,7 +1152,7 @@
               <w:pStyle w:val="ListParagraph"/>
               <w:numPr>
                 <w:ilvl w:val="0"/>
-                <w:numId w:val="8"/>
+                <w:numId w:val="4"/>
               </w:numPr>
               <w:rPr/>
             </w:pPr>
@@ -1048,7 +1165,7 @@
               <w:pStyle w:val="ListParagraph"/>
               <w:numPr>
                 <w:ilvl w:val="0"/>
-                <w:numId w:val="8"/>
+                <w:numId w:val="4"/>
               </w:numPr>
               <w:rPr/>
             </w:pPr>
@@ -1061,7 +1178,7 @@
               <w:pStyle w:val="ListParagraph"/>
               <w:numPr>
                 <w:ilvl w:val="0"/>
-                <w:numId w:val="8"/>
+                <w:numId w:val="4"/>
               </w:numPr>
               <w:rPr/>
             </w:pPr>
@@ -1074,7 +1191,7 @@
               <w:pStyle w:val="ListParagraph"/>
               <w:numPr>
                 <w:ilvl w:val="0"/>
-                <w:numId w:val="8"/>
+                <w:numId w:val="4"/>
               </w:numPr>
               <w:rPr/>
             </w:pPr>
@@ -1087,7 +1204,7 @@
               <w:pStyle w:val="ListParagraph"/>
               <w:numPr>
                 <w:ilvl w:val="0"/>
-                <w:numId w:val="9"/>
+                <w:numId w:val="4"/>
               </w:numPr>
               <w:rPr/>
             </w:pPr>
@@ -1100,7 +1217,7 @@
               <w:pStyle w:val="ListParagraph"/>
               <w:numPr>
                 <w:ilvl w:val="0"/>
-                <w:numId w:val="9"/>
+                <w:numId w:val="4"/>
               </w:numPr>
               <w:rPr/>
             </w:pPr>
@@ -1113,7 +1230,7 @@
               <w:pStyle w:val="ListParagraph"/>
               <w:numPr>
                 <w:ilvl w:val="0"/>
-                <w:numId w:val="9"/>
+                <w:numId w:val="4"/>
               </w:numPr>
               <w:rPr/>
             </w:pPr>

</xml_diff>

<commit_message>
Corriger la mise en forme de la section Description/Contenu
Problèmes résolus :
- MODULE 1 header : texte tronqué → texte complet, gras, sans puce
- Paras [05] et [06] : style Normal → List Paragraph avec puce, texte nettoyé
- Para [16] : puce parasite sur ligne vide → Normal sans puce
- MODULE 2 header : puce supprimée, gras ajouté (cohérent avec MODULE 1)
- Ajout "Mise en plan (Cartouche, stamping, etc..)" dans Module 2

Structure finale : en-têtes ── MODULE X ── en gras sans puce,
items de contenu en liste à puces uniforme.

https://claude.ai/code/session_01BKFw1pPPfkx1xTaXjcdiw8
</commit_message>
<xml_diff>
--- a/src/programme_formation_CATIA_V6_3DEXP_Automation.docx
+++ b/src/programme_formation_CATIA_V6_3DEXP_Automation.docx
@@ -966,11 +966,12 @@
             </w:r>
           </w:p>
           <w:p>
-            <w:r>
-              <w:t xml:space="preserve">       </w:t>
-            </w:r>
-            <w:r>
-              <w:t>Introduction à la plateforme 3DEXPERIENCE ──</w:t>
+            <w:pPr/>
+            <w:r>
+              <w:rPr>
+                <w:b/>
+              </w:rPr>
+              <w:t>── MODULE 1 : Introduction à la plateforme 3DEXPERIENCE ──</w:t>
             </w:r>
           </w:p>
           <w:p>
@@ -987,32 +988,62 @@
           </w:p>
           <w:p>
             <w:pPr>
-              <w:ind w:left="360"/>
+              <w:pStyle w:val="Paragraphedeliste"/>
+              <w:numPr>
+                <w:ilvl w:val="0"/>
+                <w:numId w:val="4"/>
+              </w:numPr>
             </w:pPr>
             <w:r>
               <w:t>Architecture Web n-tiers : couches Présentation, Logique et Données ; protocole HTTPS/WSS</w:t>
             </w:r>
           </w:p>
           <w:p>
-            <w:r>
-              <w:t xml:space="preserve">      </w:t>
-            </w:r>
-            <w:r>
-              <w:t xml:space="preserve">Offres de déploiement Cloud : Public Cloud, Private Cloud, </w:t>
+            <w:pPr>
+              <w:pStyle w:val="Paragraphedeliste"/>
+              <w:numPr>
+                <w:ilvl w:val="0"/>
+                <w:numId w:val="4"/>
+              </w:numPr>
+            </w:pPr>
+            <w:r>
+              <w:t>Offres de déploiement Cloud : Public Cloud, Private Cloud, Dedicated Cloud (SaaS / IaaS / PaaS)</w:t>
+            </w:r>
+          </w:p>
+          <w:p>
+            <w:pPr>
+              <w:pStyle w:val="Paragraphedeliste"/>
+              <w:numPr>
+                <w:ilvl w:val="0"/>
+                <w:numId w:val="4"/>
+              </w:numPr>
+            </w:pPr>
+            <w:r>
+              <w:t xml:space="preserve">Baseline </w:t>
             </w:r>
             <w:proofErr w:type="spellStart"/>
             <w:r>
-              <w:t>Dedicated</w:t>
+              <w:t>Behavior</w:t>
             </w:r>
             <w:proofErr w:type="spellEnd"/>
             <w:r>
+              <w:t xml:space="preserve"> vs Customer-</w:t>
+            </w:r>
+            <w:proofErr w:type="spellStart"/>
+            <w:r>
+              <w:t>Specific</w:t>
+            </w:r>
+            <w:proofErr w:type="spellEnd"/>
+            <w:r>
               <w:t xml:space="preserve"> </w:t>
             </w:r>
-            <w:r>
-              <w:t xml:space="preserve">  </w:t>
-            </w:r>
-            <w:r>
-              <w:t>Cloud (SaaS / IaaS / PaaS)</w:t>
+            <w:proofErr w:type="spellStart"/>
+            <w:r>
+              <w:t>Environment</w:t>
+            </w:r>
+            <w:proofErr w:type="spellEnd"/>
+            <w:r>
+              <w:t xml:space="preserve"> (CSE) : principes et choix d'architecture</w:t>
             </w:r>
           </w:p>
           <w:p>
@@ -1024,238 +1055,192 @@
               </w:numPr>
             </w:pPr>
             <w:r>
-              <w:t xml:space="preserve">Baseline </w:t>
+              <w:t xml:space="preserve">Feuille de route de personnalisation Baseline et CSE (On </w:t>
             </w:r>
             <w:proofErr w:type="spellStart"/>
             <w:r>
-              <w:t>Behavior</w:t>
+              <w:t>Premises</w:t>
             </w:r>
             <w:proofErr w:type="spellEnd"/>
             <w:r>
-              <w:t xml:space="preserve"> vs Customer-</w:t>
+              <w:t xml:space="preserve"> et Cloud)</w:t>
+            </w:r>
+          </w:p>
+          <w:p>
+            <w:pPr>
+              <w:pStyle w:val="Paragraphedeliste"/>
+              <w:numPr>
+                <w:ilvl w:val="0"/>
+                <w:numId w:val="5"/>
+              </w:numPr>
+            </w:pPr>
+            <w:r>
+              <w:t xml:space="preserve">Modélisation Organisationnelle et Accès Sécurisés aux Données (P&amp;O / </w:t>
             </w:r>
             <w:proofErr w:type="spellStart"/>
             <w:r>
-              <w:t>Specific</w:t>
+              <w:t>Organization</w:t>
             </w:r>
             <w:proofErr w:type="spellEnd"/>
             <w:r>
+              <w:t xml:space="preserve"> Modeling)</w:t>
+            </w:r>
+          </w:p>
+          <w:p>
+            <w:pPr>
+              <w:pStyle w:val="Paragraphedeliste"/>
+              <w:numPr>
+                <w:ilvl w:val="0"/>
+                <w:numId w:val="6"/>
+              </w:numPr>
+            </w:pPr>
+            <w:r>
+              <w:t xml:space="preserve">Concepts P&amp;O : Organisation, Collaborative Space, Rôle, Règle d'accès, Security </w:t>
+            </w:r>
+            <w:proofErr w:type="spellStart"/>
+            <w:r>
+              <w:t>Context</w:t>
+            </w:r>
+            <w:proofErr w:type="spellEnd"/>
+            <w:r>
+              <w:t xml:space="preserve">, </w:t>
+            </w:r>
+            <w:proofErr w:type="spellStart"/>
+            <w:r>
+              <w:t>Ownership</w:t>
+            </w:r>
+            <w:proofErr w:type="spellEnd"/>
+          </w:p>
+          <w:p>
+            <w:pPr>
+              <w:pStyle w:val="Paragraphedeliste"/>
+              <w:numPr>
+                <w:ilvl w:val="0"/>
+                <w:numId w:val="7"/>
+              </w:numPr>
+              <w:rPr>
+                <w:lang w:val="en-US"/>
+              </w:rPr>
+            </w:pPr>
+            <w:proofErr w:type="spellStart"/>
+            <w:r>
+              <w:rPr>
+                <w:lang w:val="en-US"/>
+              </w:rPr>
+              <w:t>Rôles</w:t>
+            </w:r>
+            <w:proofErr w:type="spellEnd"/>
+            <w:r>
+              <w:rPr>
+                <w:lang w:val="en-US"/>
+              </w:rPr>
               <w:t xml:space="preserve"> </w:t>
             </w:r>
+            <w:r>
+              <w:rPr>
+                <w:lang w:val="en-US"/>
+              </w:rPr>
+              <w:t>Baseline:</w:t>
+            </w:r>
+            <w:r>
+              <w:rPr>
+                <w:lang w:val="en-US"/>
+              </w:rPr>
+              <w:t xml:space="preserve"> Reader, Contributor, Author, Leader, Owner, Administrator, Public Reader</w:t>
+            </w:r>
+          </w:p>
+          <w:p>
+            <w:pPr>
+              <w:pStyle w:val="Paragraphedeliste"/>
+              <w:numPr>
+                <w:ilvl w:val="0"/>
+                <w:numId w:val="8"/>
+              </w:numPr>
+            </w:pPr>
             <w:proofErr w:type="spellStart"/>
             <w:r>
-              <w:t>Environment</w:t>
+              <w:t>Paramétisation</w:t>
             </w:r>
             <w:proofErr w:type="spellEnd"/>
             <w:r>
-              <w:t xml:space="preserve"> (CSE) : principes et choix d'architecture</w:t>
-            </w:r>
-          </w:p>
-          <w:p>
-            <w:pPr>
-              <w:pStyle w:val="Paragraphedeliste"/>
-              <w:numPr>
-                <w:ilvl w:val="0"/>
-                <w:numId w:val="4"/>
-              </w:numPr>
-            </w:pPr>
-            <w:r>
-              <w:t xml:space="preserve">Feuille de route de personnalisation Baseline et CSE (On </w:t>
+              <w:t xml:space="preserve"> Baseline via Collaborative </w:t>
             </w:r>
             <w:proofErr w:type="spellStart"/>
             <w:r>
-              <w:t>Premises</w:t>
+              <w:t>Spaces</w:t>
             </w:r>
             <w:proofErr w:type="spellEnd"/>
             <w:r>
-              <w:t xml:space="preserve"> et Cloud)</w:t>
-            </w:r>
-          </w:p>
-          <w:p>
-            <w:pPr>
-              <w:pStyle w:val="Paragraphedeliste"/>
-              <w:numPr>
-                <w:ilvl w:val="0"/>
-                <w:numId w:val="5"/>
-              </w:numPr>
-            </w:pPr>
-            <w:r>
-              <w:t xml:space="preserve">Modélisation Organisationnelle et Accès Sécurisés aux Données (P&amp;O / </w:t>
+              <w:t xml:space="preserve"> Control Center (sans compétences IT avancées)</w:t>
+            </w:r>
+          </w:p>
+          <w:p>
+            <w:pPr>
+              <w:pStyle w:val="Paragraphedeliste"/>
+              <w:numPr>
+                <w:ilvl w:val="0"/>
+                <w:numId w:val="8"/>
+              </w:numPr>
+            </w:pPr>
+            <w:r>
+              <w:t xml:space="preserve">Capacités de personnalisation : Administration, </w:t>
             </w:r>
             <w:proofErr w:type="spellStart"/>
             <w:r>
-              <w:t>Organization</w:t>
+              <w:t>Paramétisation</w:t>
             </w:r>
             <w:proofErr w:type="spellEnd"/>
             <w:r>
-              <w:t xml:space="preserve"> Modeling)</w:t>
-            </w:r>
-          </w:p>
-          <w:p>
-            <w:pPr>
-              <w:pStyle w:val="Paragraphedeliste"/>
-              <w:numPr>
-                <w:ilvl w:val="0"/>
-                <w:numId w:val="6"/>
-              </w:numPr>
-            </w:pPr>
-            <w:r>
-              <w:t xml:space="preserve">Concepts P&amp;O : Organisation, Collaborative Space, Rôle, Règle d'accès, Security </w:t>
-            </w:r>
+              <w:t>, Adaptation, Développement (EKL, VBA, CAA, Widget)</w:t>
+            </w:r>
+          </w:p>
+          <w:p>
+            <w:pPr>
+              <w:pStyle w:val="Paragraphedeliste"/>
+              <w:numPr>
+                <w:ilvl w:val="0"/>
+                <w:numId w:val="8"/>
+              </w:numPr>
+            </w:pPr>
             <w:proofErr w:type="spellStart"/>
             <w:r>
-              <w:t>Context</w:t>
+              <w:t>Openness</w:t>
             </w:r>
             <w:proofErr w:type="spellEnd"/>
             <w:r>
-              <w:t xml:space="preserve">, </w:t>
+              <w:t xml:space="preserve"> R2021x : langages supportés (EKL, VBA, JavaScript, HTML5, C++, JPO)</w:t>
+            </w:r>
+          </w:p>
+          <w:p>
+            <w:pPr>
+              <w:pStyle w:val="Paragraphedeliste"/>
+              <w:numPr>
+                <w:ilvl w:val="0"/>
+                <w:numId w:val="8"/>
+              </w:numPr>
+            </w:pPr>
+            <w:r>
+              <w:t>Exercice pratique : création d'un Collaborative Space, utilisateur et attributs sur type DS (</w:t>
             </w:r>
             <w:proofErr w:type="spellStart"/>
             <w:r>
-              <w:t>Ownership</w:t>
+              <w:t>VPMReference</w:t>
             </w:r>
             <w:proofErr w:type="spellEnd"/>
-          </w:p>
-          <w:p>
-            <w:pPr>
-              <w:pStyle w:val="Paragraphedeliste"/>
-              <w:numPr>
-                <w:ilvl w:val="0"/>
-                <w:numId w:val="7"/>
-              </w:numPr>
-              <w:rPr>
-                <w:lang w:val="en-US"/>
-              </w:rPr>
-            </w:pPr>
-            <w:proofErr w:type="spellStart"/>
-            <w:r>
-              <w:rPr>
-                <w:lang w:val="en-US"/>
-              </w:rPr>
-              <w:t>Rôles</w:t>
-            </w:r>
-            <w:proofErr w:type="spellEnd"/>
-            <w:r>
-              <w:rPr>
-                <w:lang w:val="en-US"/>
-              </w:rPr>
-              <w:t xml:space="preserve"> </w:t>
-            </w:r>
-            <w:r>
-              <w:rPr>
-                <w:lang w:val="en-US"/>
-              </w:rPr>
-              <w:t>Baseline:</w:t>
-            </w:r>
-            <w:r>
-              <w:rPr>
-                <w:lang w:val="en-US"/>
-              </w:rPr>
-              <w:t xml:space="preserve"> Reader, Contributor, Author, Leader, Owner, Administrator, Public Reader</w:t>
-            </w:r>
-          </w:p>
-          <w:p>
-            <w:pPr>
-              <w:pStyle w:val="Paragraphedeliste"/>
-              <w:numPr>
-                <w:ilvl w:val="0"/>
-                <w:numId w:val="8"/>
-              </w:numPr>
-            </w:pPr>
-            <w:proofErr w:type="spellStart"/>
-            <w:r>
-              <w:t>Paramétisation</w:t>
-            </w:r>
-            <w:proofErr w:type="spellEnd"/>
-            <w:r>
-              <w:t xml:space="preserve"> Baseline via Collaborative </w:t>
-            </w:r>
-            <w:proofErr w:type="spellStart"/>
-            <w:r>
-              <w:t>Spaces</w:t>
-            </w:r>
-            <w:proofErr w:type="spellEnd"/>
-            <w:r>
-              <w:t xml:space="preserve"> Control Center (sans compétences IT avancées)</w:t>
-            </w:r>
-          </w:p>
-          <w:p>
-            <w:pPr>
-              <w:pStyle w:val="Paragraphedeliste"/>
-              <w:numPr>
-                <w:ilvl w:val="0"/>
-                <w:numId w:val="8"/>
-              </w:numPr>
-            </w:pPr>
-            <w:r>
-              <w:t xml:space="preserve">Capacités de personnalisation : Administration, </w:t>
-            </w:r>
-            <w:proofErr w:type="spellStart"/>
-            <w:r>
-              <w:t>Paramétisation</w:t>
-            </w:r>
-            <w:proofErr w:type="spellEnd"/>
-            <w:r>
-              <w:t>, Adaptation, Développement (EKL, VBA, CAA, Widget)</w:t>
-            </w:r>
-          </w:p>
-          <w:p>
-            <w:pPr>
-              <w:pStyle w:val="Paragraphedeliste"/>
-              <w:numPr>
-                <w:ilvl w:val="0"/>
-                <w:numId w:val="8"/>
-              </w:numPr>
-            </w:pPr>
-            <w:proofErr w:type="spellStart"/>
-            <w:r>
-              <w:t>Openness</w:t>
-            </w:r>
-            <w:proofErr w:type="spellEnd"/>
-            <w:r>
-              <w:t xml:space="preserve"> R2021x : langages supportés (EKL, VBA, JavaScript, HTML5, C++, JPO)</w:t>
-            </w:r>
-          </w:p>
-          <w:p>
-            <w:pPr>
-              <w:pStyle w:val="Paragraphedeliste"/>
-              <w:numPr>
-                <w:ilvl w:val="0"/>
-                <w:numId w:val="8"/>
-              </w:numPr>
-            </w:pPr>
-            <w:r>
-              <w:t>Exercice pratique : création d'un Collaborative Space, utilisateur et attributs sur type DS (</w:t>
-            </w:r>
-            <w:proofErr w:type="spellStart"/>
-            <w:r>
-              <w:t>VPMReference</w:t>
-            </w:r>
-            <w:proofErr w:type="spellEnd"/>
             <w:r>
               <w:t>)</w:t>
             </w:r>
           </w:p>
           <w:p>
-            <w:pPr>
-              <w:pStyle w:val="Paragraphedeliste"/>
-              <w:numPr>
-                <w:ilvl w:val="0"/>
-                <w:numId w:val="8"/>
-              </w:numPr>
-            </w:pPr>
-          </w:p>
-          <w:p>
-            <w:pPr>
-              <w:pStyle w:val="Paragraphedeliste"/>
-              <w:numPr>
-                <w:ilvl w:val="0"/>
-                <w:numId w:val="8"/>
-              </w:numPr>
-            </w:pPr>
-            <w:r>
-              <w:lastRenderedPageBreak/>
-              <w:t>MODULE 2 : Automatisation CATIA 3DEXPERIENCE (VBScript / VBA) ──</w:t>
+            <w:pPr/>
+          </w:p>
+          <w:p>
+            <w:pPr/>
+            <w:r>
+              <w:rPr>
+                <w:b/>
+              </w:rPr>
+              <w:t>── MODULE 2 : Automatisation CATIA 3DEXPERIENCE (VBScript / VBA) ──</w:t>
             </w:r>
           </w:p>
           <w:p>

</xml_diff>